<commit_message>
Fix font rendering in PDF and DOCX using TrueType Arial with full Vietnamese unicode support
</commit_message>
<xml_diff>
--- a/NguyenThiMinhKhanh_Day22_onepager.docx
+++ b/NguyenThiMinhKhanh_Day22_onepager.docx
@@ -8,101 +8,125 @@
       </w:pPr>
       <w:r>
         <w:rPr>
+          <w:rFonts w:ascii="Arial" w:hAnsi="Arial"/>
           <w:b/>
           <w:color w:val="1F4E78"/>
-          <w:sz w:val="32"/>
+          <w:sz w:val="30"/>
         </w:rPr>
         <w:t>MONETIZATION ONE-PAGER: AUTOSUPPORT AI</w:t>
       </w:r>
     </w:p>
     <w:p>
       <w:pPr>
+        <w:spacing w:after="80"/>
         <w:jc w:val="center"/>
       </w:pPr>
       <w:r>
         <w:rPr>
+          <w:rFonts w:ascii="Arial" w:hAnsi="Arial"/>
           <w:i/>
           <w:color w:val="595959"/>
-          <w:sz w:val="19"/>
+          <w:sz w:val="17"/>
         </w:rPr>
-        <w:t>Tác giả: Nguyễn Thị Minh Khánh | Mã số: 2A202602546 | Track 1 - AI Engineering &amp; Product Management</w:t>
+        <w:t>Tác giả: Nguyễn Thị Minh Khánh | Mã: 2A202602546 | Track 1 - AI Engineering &amp; Product Management</w:t>
         <w:br/>
-        <w:t>File Excel đính kèm: NguyenThiMinhKhanh_Day22_model.xlsx | Ngày chốt số liệu: 26/08/2026</w:t>
+        <w:t>File Excel đính kèm: NguyenThiMinhKhanh_Day22_model.xlsx | Ngày chốt số liệu: 26/08/2026 | Tỷ giá: 26,000 VND / USD</w:t>
       </w:r>
     </w:p>
     <w:p>
       <w:pPr>
-        <w:spacing w:after="40"/>
-      </w:pPr>
-    </w:p>
-    <w:p>
-      <w:pPr>
-        <w:spacing w:before="160" w:after="60"/>
+        <w:spacing w:before="120" w:after="40"/>
         <w:shd w:val="clear" w:color="auto" w:fill="1F4E78"/>
       </w:pPr>
       <w:r>
         <w:rPr>
+          <w:rFonts w:ascii="Arial" w:hAnsi="Arial"/>
           <w:b/>
           <w:color w:val="FFFFFF"/>
-          <w:sz w:val="22"/>
+          <w:sz w:val="20"/>
         </w:rPr>
         <w:t xml:space="preserve">  1. TỔNG QUAN ĐỊNH VỊ SẢN PHẨM &amp; NGÂN SÁCH KHÁCH HÀNG</w:t>
       </w:r>
     </w:p>
     <w:p>
       <w:pPr>
-        <w:spacing w:after="80"/>
+        <w:spacing w:after="60" w:line="276" w:lineRule="auto"/>
       </w:pPr>
       <w:r>
         <w:rPr>
+          <w:rFonts w:ascii="Arial" w:hAnsi="Arial"/>
           <w:b/>
+          <w:sz w:val="17"/>
         </w:rPr>
         <w:t xml:space="preserve">• Tên sản phẩm: </w:t>
       </w:r>
       <w:r>
-        <w:t>AutoSupport AI — Autonomous Customer Support Resolution Agent cho E-commerce &amp; Retail SME.</w:t>
+        <w:rPr>
+          <w:rFonts w:ascii="Arial" w:hAnsi="Arial"/>
+          <w:sz w:val="17"/>
+        </w:rPr>
+        <w:t>AutoSupport AI — Autonomous Customer Support Resolution Agent cho E-commerce SME.</w:t>
         <w:br/>
       </w:r>
       <w:r>
         <w:rPr>
+          <w:rFonts w:ascii="Arial" w:hAnsi="Arial"/>
           <w:b/>
+          <w:sz w:val="17"/>
         </w:rPr>
         <w:t xml:space="preserve">• Định vị 1 câu: </w:t>
       </w:r>
       <w:r>
+        <w:rPr>
+          <w:rFonts w:ascii="Arial" w:hAnsi="Arial"/>
+          <w:sz w:val="17"/>
+        </w:rPr>
         <w:t>"Agent AI tự động tiếp nhận, tra cứu chính sách/vận đơn và giải quyết dứt điểm ticket CSKH ca đêm mà không cần nhân sự trực ca."</w:t>
         <w:br/>
       </w:r>
       <w:r>
         <w:rPr>
+          <w:rFonts w:ascii="Arial" w:hAnsi="Arial"/>
           <w:b/>
+          <w:sz w:val="17"/>
         </w:rPr>
         <w:t xml:space="preserve">• Budget Line (Ngân sách khách): </w:t>
       </w:r>
       <w:r>
-        <w:t>Rút từ Ngân sách Vận hành / Nhân sự trực ca (Ops Headcount Budget). Tiết kiệm chi phí thuê người trực đêm ($350 - $500/tháng), Founder/COO quyết định trong &lt; 7 ngày.</w:t>
+        <w:rPr>
+          <w:rFonts w:ascii="Arial" w:hAnsi="Arial"/>
+          <w:sz w:val="17"/>
+        </w:rPr>
+        <w:t>Ngân sách Vận hành / Nhân sự trực ca (Ops Headcount Budget). Tiết kiệm chi phí thuê người trực đêm ($350 - $500/tháng), Founder/COO quyết định trong &lt; 7 ngày.</w:t>
         <w:br/>
       </w:r>
       <w:r>
         <w:rPr>
+          <w:rFonts w:ascii="Arial" w:hAnsi="Arial"/>
           <w:b/>
+          <w:sz w:val="17"/>
         </w:rPr>
         <w:t xml:space="preserve">• Định nghĩa 1 Job hoàn thành: </w:t>
       </w:r>
       <w:r>
-        <w:t>"1 ticket CSKH được giải quyết dứt điểm: Khách hàng xác nhận hài lòng hoặc không phản hồi sau 24h, và không bị chuyển sang người."</w:t>
+        <w:rPr>
+          <w:rFonts w:ascii="Arial" w:hAnsi="Arial"/>
+          <w:sz w:val="17"/>
+        </w:rPr>
+        <w:t>"1 ticket CSKH được giải quyết dứt điểm: Khách hàng xác nhận hài lòng hoặc không phản hồi sau 24h, và không bị escalate sang người."</w:t>
       </w:r>
     </w:p>
     <w:p>
       <w:pPr>
-        <w:spacing w:before="160" w:after="60"/>
+        <w:spacing w:before="120" w:after="40"/>
         <w:shd w:val="clear" w:color="auto" w:fill="1F4E78"/>
       </w:pPr>
       <w:r>
         <w:rPr>
+          <w:rFonts w:ascii="Arial" w:hAnsi="Arial"/>
           <w:b/>
           <w:color w:val="FFFFFF"/>
-          <w:sz w:val="22"/>
+          <w:sz w:val="20"/>
         </w:rPr>
         <w:t xml:space="preserve">  2. KHỐI 1: UNIT ECONOMICS, COST/JOB &amp; ĐỊNH GIÁ (PRICING BLOCK)</w:t>
       </w:r>
@@ -115,10 +139,10 @@
         <w:tblLook w:firstColumn="1" w:firstRow="1" w:lastColumn="0" w:lastRow="0" w:noHBand="0" w:noVBand="1" w:val="04A0"/>
       </w:tblPr>
       <w:tblGrid>
-        <w:gridCol w:w="2628"/>
-        <w:gridCol w:w="2628"/>
-        <w:gridCol w:w="2628"/>
-        <w:gridCol w:w="2628"/>
+        <w:gridCol w:w="2700"/>
+        <w:gridCol w:w="2700"/>
+        <w:gridCol w:w="2700"/>
+        <w:gridCol w:w="2700"/>
       </w:tblGrid>
       <w:tr>
         <w:tc>
@@ -129,8 +153,9 @@
           <w:p>
             <w:r>
               <w:rPr>
+                <w:rFonts w:ascii="Arial" w:hAnsi="Arial"/>
                 <w:b/>
-                <w:sz w:val="18"/>
+                <w:sz w:val="17"/>
               </w:rPr>
               <w:t>Chỉ số Unit Economics</w:t>
             </w:r>
@@ -144,8 +169,9 @@
           <w:p>
             <w:r>
               <w:rPr>
+                <w:rFonts w:ascii="Arial" w:hAnsi="Arial"/>
                 <w:b/>
-                <w:sz w:val="18"/>
+                <w:sz w:val="17"/>
               </w:rPr>
               <w:t>Con số</w:t>
             </w:r>
@@ -159,8 +185,9 @@
           <w:p>
             <w:r>
               <w:rPr>
+                <w:rFonts w:ascii="Arial" w:hAnsi="Arial"/>
                 <w:b/>
-                <w:sz w:val="18"/>
+                <w:sz w:val="17"/>
               </w:rPr>
               <w:t>Ô Excel</w:t>
             </w:r>
@@ -168,14 +195,15 @@
         </w:tc>
         <w:tc>
           <w:tcPr>
-            <w:tcW w:type="dxa" w:w="4032"/>
+            <w:tcW w:type="dxa" w:w="4464"/>
             <w:shd w:val="clear" w:color="auto" w:fill="D9E1F2"/>
           </w:tcPr>
           <w:p>
             <w:r>
               <w:rPr>
+                <w:rFonts w:ascii="Arial" w:hAnsi="Arial"/>
                 <w:b/>
-                <w:sz w:val="18"/>
+                <w:sz w:val="17"/>
               </w:rPr>
               <w:t>Cơ sở xác lập &amp; Công thức tính toán</w:t>
             </w:r>
@@ -190,7 +218,8 @@
           <w:p>
             <w:r>
               <w:rPr>
-                <w:sz w:val="17"/>
+                <w:rFonts w:ascii="Arial" w:hAnsi="Arial"/>
+                <w:sz w:val="16"/>
               </w:rPr>
               <w:t>Quy mô tiếp nhận tháng</w:t>
             </w:r>
@@ -203,7 +232,8 @@
           <w:p>
             <w:r>
               <w:rPr>
-                <w:sz w:val="17"/>
+                <w:rFonts w:ascii="Arial" w:hAnsi="Arial"/>
+                <w:sz w:val="16"/>
               </w:rPr>
               <w:t>2,000 tickets</w:t>
             </w:r>
@@ -216,7 +246,8 @@
           <w:p>
             <w:r>
               <w:rPr>
-                <w:sz w:val="17"/>
+                <w:rFonts w:ascii="Arial" w:hAnsi="Arial"/>
+                <w:sz w:val="16"/>
               </w:rPr>
               <w:t>1_Cost_Job!B14</w:t>
             </w:r>
@@ -224,12 +255,13 @@
         </w:tc>
         <w:tc>
           <w:tcPr>
-            <w:tcW w:type="dxa" w:w="4032"/>
+            <w:tcW w:type="dxa" w:w="4464"/>
           </w:tcPr>
           <w:p>
             <w:r>
               <w:rPr>
-                <w:sz w:val="17"/>
+                <w:rFonts w:ascii="Arial" w:hAnsi="Arial"/>
+                <w:sz w:val="16"/>
               </w:rPr>
               <w:t>Quy mô shop E-commerce SMB tiêu chuẩn</w:t>
             </w:r>
@@ -244,7 +276,8 @@
           <w:p>
             <w:r>
               <w:rPr>
-                <w:sz w:val="17"/>
+                <w:rFonts w:ascii="Arial" w:hAnsi="Arial"/>
+                <w:sz w:val="16"/>
               </w:rPr>
               <w:t>Tỷ lệ Containment Rate</w:t>
             </w:r>
@@ -257,7 +290,8 @@
           <w:p>
             <w:r>
               <w:rPr>
-                <w:sz w:val="17"/>
+                <w:rFonts w:ascii="Arial" w:hAnsi="Arial"/>
+                <w:sz w:val="16"/>
               </w:rPr>
               <w:t>82.0%</w:t>
             </w:r>
@@ -270,7 +304,8 @@
           <w:p>
             <w:r>
               <w:rPr>
-                <w:sz w:val="17"/>
+                <w:rFonts w:ascii="Arial" w:hAnsi="Arial"/>
+                <w:sz w:val="16"/>
               </w:rPr>
               <w:t>1_Cost_Job!B15</w:t>
             </w:r>
@@ -278,12 +313,13 @@
         </w:tc>
         <w:tc>
           <w:tcPr>
-            <w:tcW w:type="dxa" w:w="4032"/>
+            <w:tcW w:type="dxa" w:w="4464"/>
           </w:tcPr>
           <w:p>
             <w:r>
               <w:rPr>
-                <w:sz w:val="17"/>
+                <w:rFonts w:ascii="Arial" w:hAnsi="Arial"/>
+                <w:sz w:val="16"/>
               </w:rPr>
               <w:t>Đo lường từ bộ Eval 500 test cases (Benchmark Intercom Fin 82%)</w:t>
             </w:r>
@@ -298,7 +334,9 @@
           <w:p>
             <w:r>
               <w:rPr>
-                <w:sz w:val="17"/>
+                <w:rFonts w:ascii="Arial" w:hAnsi="Arial"/>
+                <w:b/>
+                <w:sz w:val="16"/>
               </w:rPr>
               <w:t>Số Job HOÀN THÀNH (Mẫu số)</w:t>
             </w:r>
@@ -307,11 +345,14 @@
         <w:tc>
           <w:tcPr>
             <w:tcW w:type="dxa" w:w="1584"/>
+            <w:shd w:val="clear" w:color="auto" w:fill="E2EFDA"/>
           </w:tcPr>
           <w:p>
             <w:r>
               <w:rPr>
-                <w:sz w:val="17"/>
+                <w:rFonts w:ascii="Arial" w:hAnsi="Arial"/>
+                <w:b/>
+                <w:sz w:val="16"/>
               </w:rPr>
               <w:t>1,640 jobs</w:t>
             </w:r>
@@ -324,7 +365,9 @@
           <w:p>
             <w:r>
               <w:rPr>
-                <w:sz w:val="17"/>
+                <w:rFonts w:ascii="Arial" w:hAnsi="Arial"/>
+                <w:b/>
+                <w:sz w:val="16"/>
               </w:rPr>
               <w:t>1_Cost_Job!B16</w:t>
             </w:r>
@@ -332,12 +375,14 @@
         </w:tc>
         <w:tc>
           <w:tcPr>
-            <w:tcW w:type="dxa" w:w="4032"/>
+            <w:tcW w:type="dxa" w:w="4464"/>
           </w:tcPr>
           <w:p>
             <w:r>
               <w:rPr>
-                <w:sz w:val="17"/>
+                <w:rFonts w:ascii="Arial" w:hAnsi="Arial"/>
+                <w:b/>
+                <w:sz w:val="16"/>
               </w:rPr>
               <w:t>= 2,000 x 82.0% (MẪU SỐ THẬT ĐỂ TÍNH COST/JOB)</w:t>
             </w:r>
@@ -352,7 +397,8 @@
           <w:p>
             <w:r>
               <w:rPr>
-                <w:sz w:val="17"/>
+                <w:rFonts w:ascii="Arial" w:hAnsi="Arial"/>
+                <w:sz w:val="16"/>
               </w:rPr>
               <w:t>Chi phí LLM API / ticket</w:t>
             </w:r>
@@ -365,7 +411,8 @@
           <w:p>
             <w:r>
               <w:rPr>
-                <w:sz w:val="17"/>
+                <w:rFonts w:ascii="Arial" w:hAnsi="Arial"/>
+                <w:sz w:val="16"/>
               </w:rPr>
               <w:t>$0.0128</w:t>
             </w:r>
@@ -378,7 +425,8 @@
           <w:p>
             <w:r>
               <w:rPr>
-                <w:sz w:val="17"/>
+                <w:rFonts w:ascii="Arial" w:hAnsi="Arial"/>
+                <w:sz w:val="16"/>
               </w:rPr>
               <w:t>1_Cost_Job!B34</w:t>
             </w:r>
@@ -386,12 +434,13 @@
         </w:tc>
         <w:tc>
           <w:tcPr>
-            <w:tcW w:type="dxa" w:w="4032"/>
+            <w:tcW w:type="dxa" w:w="4464"/>
           </w:tcPr>
           <w:p>
             <w:r>
               <w:rPr>
-                <w:sz w:val="17"/>
+                <w:rFonts w:ascii="Arial" w:hAnsi="Arial"/>
+                <w:sz w:val="16"/>
               </w:rPr>
               <w:t>Claude 3.5 Haiku (Prompt Cache cắt 50.0% chi phí token)</w:t>
             </w:r>
@@ -406,7 +455,8 @@
           <w:p>
             <w:r>
               <w:rPr>
-                <w:sz w:val="17"/>
+                <w:rFonts w:ascii="Arial" w:hAnsi="Arial"/>
+                <w:sz w:val="16"/>
               </w:rPr>
               <w:t>Chi phí Hạ tầng / ticket</w:t>
             </w:r>
@@ -419,7 +469,8 @@
           <w:p>
             <w:r>
               <w:rPr>
-                <w:sz w:val="17"/>
+                <w:rFonts w:ascii="Arial" w:hAnsi="Arial"/>
+                <w:sz w:val="16"/>
               </w:rPr>
               <w:t>$0.0060</w:t>
             </w:r>
@@ -432,7 +483,8 @@
           <w:p>
             <w:r>
               <w:rPr>
-                <w:sz w:val="17"/>
+                <w:rFonts w:ascii="Arial" w:hAnsi="Arial"/>
+                <w:sz w:val="16"/>
               </w:rPr>
               <w:t>1_Cost_Job!B46</w:t>
             </w:r>
@@ -440,12 +492,13 @@
         </w:tc>
         <w:tc>
           <w:tcPr>
-            <w:tcW w:type="dxa" w:w="4032"/>
+            <w:tcW w:type="dxa" w:w="4464"/>
           </w:tcPr>
           <w:p>
             <w:r>
               <w:rPr>
-                <w:sz w:val="17"/>
+                <w:rFonts w:ascii="Arial" w:hAnsi="Arial"/>
+                <w:sz w:val="16"/>
               </w:rPr>
               <w:t>Vector DB ($0.003) + LangSmith Logging ($0.0015) + Serverless ($0.0015)</w:t>
             </w:r>
@@ -460,7 +513,8 @@
           <w:p>
             <w:r>
               <w:rPr>
-                <w:sz w:val="17"/>
+                <w:rFonts w:ascii="Arial" w:hAnsi="Arial"/>
+                <w:sz w:val="16"/>
               </w:rPr>
               <w:t>Chi phí Retry dự phòng (8%)</w:t>
             </w:r>
@@ -473,7 +527,8 @@
           <w:p>
             <w:r>
               <w:rPr>
-                <w:sz w:val="17"/>
+                <w:rFonts w:ascii="Arial" w:hAnsi="Arial"/>
+                <w:sz w:val="16"/>
               </w:rPr>
               <w:t>$2.04 / tháng</w:t>
             </w:r>
@@ -486,7 +541,8 @@
           <w:p>
             <w:r>
               <w:rPr>
-                <w:sz w:val="17"/>
+                <w:rFonts w:ascii="Arial" w:hAnsi="Arial"/>
+                <w:sz w:val="16"/>
               </w:rPr>
               <w:t>1_Cost_Job!B51</w:t>
             </w:r>
@@ -494,12 +550,13 @@
         </w:tc>
         <w:tc>
           <w:tcPr>
-            <w:tcW w:type="dxa" w:w="4032"/>
+            <w:tcW w:type="dxa" w:w="4464"/>
           </w:tcPr>
           <w:p>
             <w:r>
               <w:rPr>
-                <w:sz w:val="17"/>
+                <w:rFonts w:ascii="Arial" w:hAnsi="Arial"/>
+                <w:sz w:val="16"/>
               </w:rPr>
               <w:t>= $25.50 (LLM) x 8% (Dự phòng lỗi API/timeout)</w:t>
             </w:r>
@@ -514,7 +571,8 @@
           <w:p>
             <w:r>
               <w:rPr>
-                <w:sz w:val="17"/>
+                <w:rFonts w:ascii="Arial" w:hAnsi="Arial"/>
+                <w:sz w:val="16"/>
               </w:rPr>
               <w:t>Chi phí HITL (Biến thể B)</w:t>
             </w:r>
@@ -527,7 +585,8 @@
           <w:p>
             <w:r>
               <w:rPr>
-                <w:sz w:val="17"/>
+                <w:rFonts w:ascii="Arial" w:hAnsi="Arial"/>
+                <w:sz w:val="16"/>
               </w:rPr>
               <w:t>$236.00 / tháng</w:t>
             </w:r>
@@ -540,7 +599,8 @@
           <w:p>
             <w:r>
               <w:rPr>
-                <w:sz w:val="17"/>
+                <w:rFonts w:ascii="Arial" w:hAnsi="Arial"/>
+                <w:sz w:val="16"/>
               </w:rPr>
               <w:t>1_Cost_Job!B64</w:t>
             </w:r>
@@ -548,12 +608,13 @@
         </w:tc>
         <w:tc>
           <w:tcPr>
-            <w:tcW w:type="dxa" w:w="4032"/>
+            <w:tcW w:type="dxa" w:w="4464"/>
           </w:tcPr>
           <w:p>
             <w:r>
               <w:rPr>
-                <w:sz w:val="17"/>
+                <w:rFonts w:ascii="Arial" w:hAnsi="Arial"/>
+                <w:sz w:val="16"/>
               </w:rPr>
               <w:t>QA audit 5% ($20.00) + 360 ca escalate (6 phút @ $6/h = $216.00)</w:t>
             </w:r>
@@ -568,7 +629,8 @@
           <w:p>
             <w:r>
               <w:rPr>
-                <w:sz w:val="17"/>
+                <w:rFonts w:ascii="Arial" w:hAnsi="Arial"/>
+                <w:sz w:val="16"/>
               </w:rPr>
               <w:t>COST / JOB (Biến thể A - SaaS)</w:t>
             </w:r>
@@ -581,7 +643,8 @@
           <w:p>
             <w:r>
               <w:rPr>
-                <w:sz w:val="17"/>
+                <w:rFonts w:ascii="Arial" w:hAnsi="Arial"/>
+                <w:sz w:val="16"/>
               </w:rPr>
               <w:t>$0.0363 / job</w:t>
             </w:r>
@@ -594,7 +657,8 @@
           <w:p>
             <w:r>
               <w:rPr>
-                <w:sz w:val="17"/>
+                <w:rFonts w:ascii="Arial" w:hAnsi="Arial"/>
+                <w:sz w:val="16"/>
               </w:rPr>
               <w:t>1_Cost_Job!B76</w:t>
             </w:r>
@@ -602,12 +666,13 @@
         </w:tc>
         <w:tc>
           <w:tcPr>
-            <w:tcW w:type="dxa" w:w="4032"/>
+            <w:tcW w:type="dxa" w:w="4464"/>
           </w:tcPr>
           <w:p>
             <w:r>
               <w:rPr>
-                <w:sz w:val="17"/>
+                <w:rFonts w:ascii="Arial" w:hAnsi="Arial"/>
+                <w:sz w:val="16"/>
               </w:rPr>
               <w:t>Khách tự gánh ca escalate (~944 VNĐ / job)</w:t>
             </w:r>
@@ -622,7 +687,8 @@
           <w:p>
             <w:r>
               <w:rPr>
-                <w:sz w:val="17"/>
+                <w:rFonts w:ascii="Arial" w:hAnsi="Arial"/>
+                <w:sz w:val="16"/>
               </w:rPr>
               <w:t>COST / JOB (Biến thể B - Managed)</w:t>
             </w:r>
@@ -635,7 +701,8 @@
           <w:p>
             <w:r>
               <w:rPr>
-                <w:sz w:val="17"/>
+                <w:rFonts w:ascii="Arial" w:hAnsi="Arial"/>
+                <w:sz w:val="16"/>
               </w:rPr>
               <w:t>$0.1680 / job</w:t>
             </w:r>
@@ -648,7 +715,8 @@
           <w:p>
             <w:r>
               <w:rPr>
-                <w:sz w:val="17"/>
+                <w:rFonts w:ascii="Arial" w:hAnsi="Arial"/>
+                <w:sz w:val="16"/>
               </w:rPr>
               <w:t>1_Cost_Job!B77</w:t>
             </w:r>
@@ -656,12 +724,13 @@
         </w:tc>
         <w:tc>
           <w:tcPr>
-            <w:tcW w:type="dxa" w:w="4032"/>
+            <w:tcW w:type="dxa" w:w="4464"/>
           </w:tcPr>
           <w:p>
             <w:r>
               <w:rPr>
-                <w:sz w:val="17"/>
+                <w:rFonts w:ascii="Arial" w:hAnsi="Arial"/>
+                <w:sz w:val="16"/>
               </w:rPr>
               <w:t>Bán Outcome trọn gói gồm chi phí escalate (~4,368 VNĐ / job)</w:t>
             </w:r>
@@ -676,7 +745,8 @@
           <w:p>
             <w:r>
               <w:rPr>
-                <w:sz w:val="17"/>
+                <w:rFonts w:ascii="Arial" w:hAnsi="Arial"/>
+                <w:sz w:val="16"/>
               </w:rPr>
               <w:t>Giá SÀN tối thiểu (3 x Cost/Job)</w:t>
             </w:r>
@@ -689,7 +759,8 @@
           <w:p>
             <w:r>
               <w:rPr>
-                <w:sz w:val="17"/>
+                <w:rFonts w:ascii="Arial" w:hAnsi="Arial"/>
+                <w:sz w:val="16"/>
               </w:rPr>
               <w:t>$0.504 / job</w:t>
             </w:r>
@@ -702,7 +773,8 @@
           <w:p>
             <w:r>
               <w:rPr>
-                <w:sz w:val="17"/>
+                <w:rFonts w:ascii="Arial" w:hAnsi="Arial"/>
+                <w:sz w:val="16"/>
               </w:rPr>
               <w:t>2_Pricing!B7</w:t>
             </w:r>
@@ -710,12 +782,13 @@
         </w:tc>
         <w:tc>
           <w:tcPr>
-            <w:tcW w:type="dxa" w:w="4032"/>
+            <w:tcW w:type="dxa" w:w="4464"/>
           </w:tcPr>
           <w:p>
             <w:r>
               <w:rPr>
-                <w:sz w:val="17"/>
+                <w:rFonts w:ascii="Arial" w:hAnsi="Arial"/>
+                <w:sz w:val="16"/>
               </w:rPr>
               <w:t>= $0.1680 x 3 (Đảm bảo Gross Margin &gt;= 66.7%)</w:t>
             </w:r>
@@ -730,8 +803,9 @@
           <w:p>
             <w:r>
               <w:rPr>
+                <w:rFonts w:ascii="Arial" w:hAnsi="Arial"/>
                 <w:b/>
-                <w:sz w:val="17"/>
+                <w:sz w:val="16"/>
               </w:rPr>
               <w:t>GIÁ BÁN ĐỀ XUẤT</w:t>
             </w:r>
@@ -745,8 +819,9 @@
           <w:p>
             <w:r>
               <w:rPr>
+                <w:rFonts w:ascii="Arial" w:hAnsi="Arial"/>
                 <w:b/>
-                <w:sz w:val="17"/>
+                <w:sz w:val="16"/>
               </w:rPr>
               <w:t>$0.60 / resolution</w:t>
             </w:r>
@@ -759,8 +834,9 @@
           <w:p>
             <w:r>
               <w:rPr>
+                <w:rFonts w:ascii="Arial" w:hAnsi="Arial"/>
                 <w:b/>
-                <w:sz w:val="17"/>
+                <w:sz w:val="16"/>
               </w:rPr>
               <w:t>2_Pricing!B11</w:t>
             </w:r>
@@ -768,13 +844,14 @@
         </w:tc>
         <w:tc>
           <w:tcPr>
-            <w:tcW w:type="dxa" w:w="4032"/>
+            <w:tcW w:type="dxa" w:w="4464"/>
           </w:tcPr>
           <w:p>
             <w:r>
               <w:rPr>
+                <w:rFonts w:ascii="Arial" w:hAnsi="Arial"/>
                 <w:b/>
-                <w:sz w:val="17"/>
+                <w:sz w:val="16"/>
               </w:rPr>
               <w:t>~15,600 VNĐ / ticket xong (Gói Hybrid $99 + $0.50 vượt)</w:t>
             </w:r>
@@ -789,8 +866,9 @@
           <w:p>
             <w:r>
               <w:rPr>
+                <w:rFonts w:ascii="Arial" w:hAnsi="Arial"/>
                 <w:b/>
-                <w:sz w:val="17"/>
+                <w:sz w:val="16"/>
               </w:rPr>
               <w:t>GROSS MARGIN % (ở 82% Containment)</w:t>
             </w:r>
@@ -804,8 +882,9 @@
           <w:p>
             <w:r>
               <w:rPr>
+                <w:rFonts w:ascii="Arial" w:hAnsi="Arial"/>
                 <w:b/>
-                <w:sz w:val="17"/>
+                <w:sz w:val="16"/>
               </w:rPr>
               <w:t>72.0%</w:t>
             </w:r>
@@ -818,8 +897,9 @@
           <w:p>
             <w:r>
               <w:rPr>
+                <w:rFonts w:ascii="Arial" w:hAnsi="Arial"/>
                 <w:b/>
-                <w:sz w:val="17"/>
+                <w:sz w:val="16"/>
               </w:rPr>
               <w:t>2_Pricing!B14</w:t>
             </w:r>
@@ -827,13 +907,14 @@
         </w:tc>
         <w:tc>
           <w:tcPr>
-            <w:tcW w:type="dxa" w:w="4032"/>
+            <w:tcW w:type="dxa" w:w="4464"/>
           </w:tcPr>
           <w:p>
             <w:r>
               <w:rPr>
+                <w:rFonts w:ascii="Arial" w:hAnsi="Arial"/>
                 <w:b/>
-                <w:sz w:val="17"/>
+                <w:sz w:val="16"/>
               </w:rPr>
               <w:t>= ($0.60 - $0.1680) / $0.60 (ĐẠT CHUẨN XUẤT SẮC &gt;= 60%)</w:t>
             </w:r>
@@ -848,8 +929,9 @@
           <w:p>
             <w:r>
               <w:rPr>
+                <w:rFonts w:ascii="Arial" w:hAnsi="Arial"/>
                 <w:b/>
-                <w:sz w:val="17"/>
+                <w:sz w:val="16"/>
               </w:rPr>
               <w:t>BREAKEVEN CONTAINMENT RATE</w:t>
             </w:r>
@@ -863,8 +945,9 @@
           <w:p>
             <w:r>
               <w:rPr>
+                <w:rFonts w:ascii="Arial" w:hAnsi="Arial"/>
                 <w:b/>
-                <w:sz w:val="17"/>
+                <w:sz w:val="16"/>
               </w:rPr>
               <w:t>68.4%</w:t>
             </w:r>
@@ -877,8 +960,9 @@
           <w:p>
             <w:r>
               <w:rPr>
+                <w:rFonts w:ascii="Arial" w:hAnsi="Arial"/>
                 <w:b/>
-                <w:sz w:val="17"/>
+                <w:sz w:val="16"/>
               </w:rPr>
               <w:t>2_Pricing!B31</w:t>
             </w:r>
@@ -886,13 +970,14 @@
         </w:tc>
         <w:tc>
           <w:tcPr>
-            <w:tcW w:type="dxa" w:w="4032"/>
+            <w:tcW w:type="dxa" w:w="4464"/>
           </w:tcPr>
           <w:p>
             <w:r>
               <w:rPr>
+                <w:rFonts w:ascii="Arial" w:hAnsi="Arial"/>
                 <w:b/>
-                <w:sz w:val="17"/>
+                <w:sz w:val="16"/>
               </w:rPr>
               <w:t>Ngưỡng sinh tử để GM &gt;= 60% (Biên an toàn hiện tại: +13.6%)</w:t>
             </w:r>
@@ -902,125 +987,130 @@
     </w:tbl>
     <w:p>
       <w:pPr>
-        <w:spacing w:before="160" w:after="60"/>
+        <w:spacing w:before="120" w:after="40"/>
         <w:shd w:val="clear" w:color="auto" w:fill="1F4E78"/>
       </w:pPr>
       <w:r>
         <w:rPr>
+          <w:rFonts w:ascii="Arial" w:hAnsi="Arial"/>
           <w:b/>
           <w:color w:val="FFFFFF"/>
-          <w:sz w:val="22"/>
+          <w:sz w:val="20"/>
         </w:rPr>
         <w:t xml:space="preserve">  3. KHỐI 2: KÊNH PHÂN PHỐI GTM, PAIN MOMENT &amp; KẾ HOẠCH 90 NGÀY</w:t>
       </w:r>
     </w:p>
     <w:p>
       <w:pPr>
-        <w:spacing w:after="60"/>
+        <w:spacing w:after="60" w:line="276" w:lineRule="auto"/>
       </w:pPr>
       <w:r>
         <w:rPr>
+          <w:rFonts w:ascii="Arial" w:hAnsi="Arial"/>
           <w:b/>
+          <w:sz w:val="17"/>
         </w:rPr>
         <w:t xml:space="preserve">• Ngân sách CAC cho phép: </w:t>
       </w:r>
       <w:r>
-        <w:t xml:space="preserve">ARPU ($300) x GM (72%) x Payback (12 tháng) = </w:t>
-      </w:r>
-      <w:r>
         <w:rPr>
-          <w:b/>
+          <w:rFonts w:ascii="Arial" w:hAnsi="Arial"/>
+          <w:sz w:val="17"/>
         </w:rPr>
-        <w:t>$2,592 / khách hàng</w:t>
-      </w:r>
-      <w:r>
-        <w:t xml:space="preserve"> (4_Channel_Fit!B10).</w:t>
+        <w:t>ARPU ($300) x GM (72%) x Payback (12 tháng) = $2,592 / khách hàng (4_Channel_Fit!B10).</w:t>
         <w:br/>
       </w:r>
       <w:r>
         <w:rPr>
+          <w:rFonts w:ascii="Arial" w:hAnsi="Arial"/>
           <w:b/>
+          <w:sz w:val="17"/>
         </w:rPr>
         <w:t xml:space="preserve">• Inside Sales Reality Check: </w:t>
       </w:r>
       <w:r>
-        <w:t xml:space="preserve">Cost per Opportunity của Sales Rep SMB = $6,300, Win rate 25% -&gt; CAC thực tế = $25,200. Hệ số lệch = $25,200 / $2,592 = </w:t>
-      </w:r>
-      <w:r>
         <w:rPr>
-          <w:b/>
+          <w:rFonts w:ascii="Arial" w:hAnsi="Arial"/>
+          <w:sz w:val="17"/>
         </w:rPr>
-        <w:t>9.7 lần</w:t>
-      </w:r>
-      <w:r>
-        <w:t xml:space="preserve"> -&gt; Sales-Led thuần túy sẽ làm cạn kiệt dòng tiền.</w:t>
+        <w:t>Cost per Opportunity của Sales Rep SMB = $6,300, Win rate 25% -&gt; CAC thực tế = $25,200. Hệ số lệch = $25,200 / $2,592 = 9.7 lần -&gt; Sales-Led thuần túy sẽ làm cạn kiệt dòng tiền.</w:t>
         <w:br/>
       </w:r>
       <w:r>
         <w:rPr>
+          <w:rFonts w:ascii="Arial" w:hAnsi="Arial"/>
           <w:b/>
+          <w:sz w:val="17"/>
         </w:rPr>
         <w:t xml:space="preserve">• Kênh GTM lựa chọn duy nhất: </w:t>
       </w:r>
       <w:r>
         <w:rPr>
-          <w:b/>
+          <w:rFonts w:ascii="Arial" w:hAnsi="Arial"/>
+          <w:sz w:val="17"/>
         </w:rPr>
-        <w:t xml:space="preserve">PARTNER-LED (Platform Ecosystem) </w:t>
-      </w:r>
-      <w:r>
-        <w:t xml:space="preserve">kết hợp PLG Freemium 100 resolutions. Nhúng trực tiếp vào </w:t>
-      </w:r>
-      <w:r>
-        <w:rPr>
-          <w:b/>
-        </w:rPr>
-        <w:t>Pancake / BotCake</w:t>
-      </w:r>
-      <w:r>
-        <w:t xml:space="preserve"> (50,000+ shop E-commerce VN), Haravan &amp; Zalo OA. Chia sẻ 20% revenue share cho Partner; CAC thực tế &lt; $150, Payback 0.7 tháng.</w:t>
+        <w:t>PARTNER-LED (Platform Ecosystem) kết hợp PLG Freemium 100 resolutions. Nhúng trực tiếp vào Pancake / BotCake (50,000+ shop E-commerce VN), Haravan &amp; Zalo OA. Chia sẻ 20% revenue share cho Partner; CAC thực tế &lt; $150, Payback 0.7 tháng.</w:t>
         <w:br/>
       </w:r>
       <w:r>
         <w:rPr>
+          <w:rFonts w:ascii="Arial" w:hAnsi="Arial"/>
           <w:b/>
+          <w:sz w:val="17"/>
         </w:rPr>
         <w:t xml:space="preserve">• Pain Moment (3 phần): </w:t>
       </w:r>
       <w:r>
+        <w:rPr>
+          <w:rFonts w:ascii="Arial" w:hAnsi="Arial"/>
+          <w:sz w:val="17"/>
+        </w:rPr>
         <w:t>22h00 - 02h00 sáng (Giờ) | Khách giục đơn/đổi size nhưng nhân viên off ca dồn ứ tin nhắn (Đang làm gì) | Đang mở Pancake Inbox / Zalo OA kiểm tra (App).</w:t>
         <w:br/>
       </w:r>
       <w:r>
         <w:rPr>
+          <w:rFonts w:ascii="Arial" w:hAnsi="Arial"/>
           <w:b/>
+          <w:sz w:val="17"/>
         </w:rPr>
         <w:t xml:space="preserve">• Điểm nhúng (Zero Friction): </w:t>
       </w:r>
       <w:r>
+        <w:rPr>
+          <w:rFonts w:ascii="Arial" w:hAnsi="Arial"/>
+          <w:sz w:val="17"/>
+        </w:rPr>
         <w:t>Cài đặt 1-click qua Webhook vào Pancake/Zalo OA, bot tự động kích hoạt ca đêm trong luồng chat hiện tại.</w:t>
         <w:br/>
       </w:r>
       <w:r>
         <w:rPr>
+          <w:rFonts w:ascii="Arial" w:hAnsi="Arial"/>
           <w:b/>
+          <w:sz w:val="17"/>
         </w:rPr>
         <w:t xml:space="preserve">• Kế hoạch 90 ngày: </w:t>
       </w:r>
       <w:r>
+        <w:rPr>
+          <w:rFonts w:ascii="Arial" w:hAnsi="Arial"/>
+          <w:sz w:val="17"/>
+        </w:rPr>
         <w:t>T1: 5 Design Partners, Containment &gt;= 80%, CSAT &gt;= 4.5/5 -&gt; T2-3: Public Pancake Marketplace, 50 khách trả phí, MRR $5k, CAC &lt; $150 -&gt; T4+: Mở rộng Haravan/Zalo, Action Agent, 150 khách, MRR $15k, GM &gt; 70%.</w:t>
       </w:r>
     </w:p>
     <w:p>
       <w:pPr>
-        <w:spacing w:before="160" w:after="60"/>
+        <w:spacing w:before="120" w:after="40"/>
         <w:shd w:val="clear" w:color="auto" w:fill="1F4E78"/>
       </w:pPr>
       <w:r>
         <w:rPr>
+          <w:rFonts w:ascii="Arial" w:hAnsi="Arial"/>
           <w:b/>
           <w:color w:val="FFFFFF"/>
-          <w:sz w:val="22"/>
+          <w:sz w:val="20"/>
         </w:rPr>
         <w:t xml:space="preserve">  4. KHỐI 3: EVIDENCE PACK (3 TÀI SẢN VƯỢT QUA IT &amp; PROCUREMENT)</w:t>
       </w:r>
@@ -1033,10 +1123,10 @@
         <w:tblLook w:firstColumn="1" w:firstRow="1" w:lastColumn="0" w:lastRow="0" w:noHBand="0" w:noVBand="1" w:val="04A0"/>
       </w:tblPr>
       <w:tblGrid>
-        <w:gridCol w:w="2628"/>
-        <w:gridCol w:w="2628"/>
-        <w:gridCol w:w="2628"/>
-        <w:gridCol w:w="2628"/>
+        <w:gridCol w:w="2700"/>
+        <w:gridCol w:w="2700"/>
+        <w:gridCol w:w="2700"/>
+        <w:gridCol w:w="2700"/>
       </w:tblGrid>
       <w:tr>
         <w:tc>
@@ -1047,8 +1137,9 @@
           <w:p>
             <w:r>
               <w:rPr>
+                <w:rFonts w:ascii="Arial" w:hAnsi="Arial"/>
                 <w:b/>
-                <w:sz w:val="18"/>
+                <w:sz w:val="17"/>
               </w:rPr>
               <w:t>Tài sản thẩm định</w:t>
             </w:r>
@@ -1062,8 +1153,9 @@
           <w:p>
             <w:r>
               <w:rPr>
+                <w:rFonts w:ascii="Arial" w:hAnsi="Arial"/>
                 <w:b/>
-                <w:sz w:val="18"/>
+                <w:sz w:val="17"/>
               </w:rPr>
               <w:t>Trạng thái</w:t>
             </w:r>
@@ -1071,14 +1163,15 @@
         </w:tc>
         <w:tc>
           <w:tcPr>
-            <w:tcW w:type="dxa" w:w="3888"/>
+            <w:tcW w:type="dxa" w:w="4176"/>
             <w:shd w:val="clear" w:color="auto" w:fill="D9E1F2"/>
           </w:tcPr>
           <w:p>
             <w:r>
               <w:rPr>
+                <w:rFonts w:ascii="Arial" w:hAnsi="Arial"/>
                 <w:b/>
-                <w:sz w:val="18"/>
+                <w:sz w:val="17"/>
               </w:rPr>
               <w:t>Nội dung chứng minh cụ thể</w:t>
             </w:r>
@@ -1086,14 +1179,15 @@
         </w:tc>
         <w:tc>
           <w:tcPr>
-            <w:tcW w:type="dxa" w:w="2160"/>
+            <w:tcW w:type="dxa" w:w="2304"/>
             <w:shd w:val="clear" w:color="auto" w:fill="D9E1F2"/>
           </w:tcPr>
           <w:p>
             <w:r>
               <w:rPr>
+                <w:rFonts w:ascii="Arial" w:hAnsi="Arial"/>
                 <w:b/>
-                <w:sz w:val="18"/>
+                <w:sz w:val="17"/>
               </w:rPr>
               <w:t>Thời hạn &amp; Trách nhiệm</w:t>
             </w:r>
@@ -1108,7 +1202,8 @@
           <w:p>
             <w:r>
               <w:rPr>
-                <w:sz w:val="17"/>
+                <w:rFonts w:ascii="Arial" w:hAnsi="Arial"/>
+                <w:sz w:val="16"/>
               </w:rPr>
               <w:t>1. Eval Results</w:t>
             </w:r>
@@ -1122,8 +1217,9 @@
           <w:p>
             <w:r>
               <w:rPr>
+                <w:rFonts w:ascii="Arial" w:hAnsi="Arial"/>
                 <w:b/>
-                <w:sz w:val="17"/>
+                <w:sz w:val="16"/>
               </w:rPr>
               <w:t>ĐÃ CÓ (Verified)</w:t>
             </w:r>
@@ -1131,12 +1227,13 @@
         </w:tc>
         <w:tc>
           <w:tcPr>
-            <w:tcW w:type="dxa" w:w="3888"/>
+            <w:tcW w:type="dxa" w:w="4176"/>
           </w:tcPr>
           <w:p>
             <w:r>
               <w:rPr>
-                <w:sz w:val="17"/>
+                <w:rFonts w:ascii="Arial" w:hAnsi="Arial"/>
+                <w:sz w:val="16"/>
               </w:rPr>
               <w:t>Bộ 500 test cases thực chiến: Accuracy 96.4%, Containment 82.0%, Fallback an toàn 98.8%, 0 hallucination gây hại.</w:t>
             </w:r>
@@ -1144,12 +1241,13 @@
         </w:tc>
         <w:tc>
           <w:tcPr>
-            <w:tcW w:type="dxa" w:w="2160"/>
+            <w:tcW w:type="dxa" w:w="2304"/>
           </w:tcPr>
           <w:p>
             <w:r>
               <w:rPr>
-                <w:sz w:val="17"/>
+                <w:rFonts w:ascii="Arial" w:hAnsi="Arial"/>
+                <w:sz w:val="16"/>
               </w:rPr>
               <w:t>AI Lead Engineer (Đã nghiệm thu)</w:t>
             </w:r>
@@ -1164,7 +1262,8 @@
           <w:p>
             <w:r>
               <w:rPr>
-                <w:sz w:val="17"/>
+                <w:rFonts w:ascii="Arial" w:hAnsi="Arial"/>
+                <w:sz w:val="16"/>
               </w:rPr>
               <w:t>2. Security Q&amp;A</w:t>
             </w:r>
@@ -1178,8 +1277,9 @@
           <w:p>
             <w:r>
               <w:rPr>
+                <w:rFonts w:ascii="Arial" w:hAnsi="Arial"/>
                 <w:b/>
-                <w:sz w:val="17"/>
+                <w:sz w:val="16"/>
               </w:rPr>
               <w:t>ĐÃ CÓ (Ready)</w:t>
             </w:r>
@@ -1187,12 +1287,13 @@
         </w:tc>
         <w:tc>
           <w:tcPr>
-            <w:tcW w:type="dxa" w:w="3888"/>
+            <w:tcW w:type="dxa" w:w="4176"/>
           </w:tcPr>
           <w:p>
             <w:r>
               <w:rPr>
-                <w:sz w:val="17"/>
+                <w:rFonts w:ascii="Arial" w:hAnsi="Arial"/>
+                <w:sz w:val="16"/>
               </w:rPr>
               <w:t>Cam kết Zero Data Retention API (không dùng data train model), AES-256 AWS Singapore, Data Export JSON/CSV 1-click.</w:t>
             </w:r>
@@ -1200,12 +1301,13 @@
         </w:tc>
         <w:tc>
           <w:tcPr>
-            <w:tcW w:type="dxa" w:w="2160"/>
+            <w:tcW w:type="dxa" w:w="2304"/>
           </w:tcPr>
           <w:p>
             <w:r>
               <w:rPr>
-                <w:sz w:val="17"/>
+                <w:rFonts w:ascii="Arial" w:hAnsi="Arial"/>
+                <w:sz w:val="16"/>
               </w:rPr>
               <w:t>CTO &amp; Compliance (Đã sẵn sàng)</w:t>
             </w:r>
@@ -1220,7 +1322,8 @@
           <w:p>
             <w:r>
               <w:rPr>
-                <w:sz w:val="17"/>
+                <w:rFonts w:ascii="Arial" w:hAnsi="Arial"/>
+                <w:sz w:val="16"/>
               </w:rPr>
               <w:t>3. Pilot Report</w:t>
             </w:r>
@@ -1234,8 +1337,9 @@
           <w:p>
             <w:r>
               <w:rPr>
+                <w:rFonts w:ascii="Arial" w:hAnsi="Arial"/>
                 <w:b/>
-                <w:sz w:val="17"/>
+                <w:sz w:val="16"/>
               </w:rPr>
               <w:t>ĐANG LÀM</w:t>
             </w:r>
@@ -1243,12 +1347,13 @@
         </w:tc>
         <w:tc>
           <w:tcPr>
-            <w:tcW w:type="dxa" w:w="3888"/>
+            <w:tcW w:type="dxa" w:w="4176"/>
           </w:tcPr>
           <w:p>
             <w:r>
               <w:rPr>
-                <w:sz w:val="17"/>
+                <w:rFonts w:ascii="Arial" w:hAnsi="Arial"/>
+                <w:sz w:val="16"/>
               </w:rPr>
               <w:t>Pilot 3 tuần tại Shop Thời trang D2C (2k ticket/tháng): 1,640 ticket ca đêm, phản hồi 6s, tiết kiệm 10.5 triệu VNĐ chi phí trực ca.</w:t>
             </w:r>
@@ -1256,12 +1361,13 @@
         </w:tc>
         <w:tc>
           <w:tcPr>
-            <w:tcW w:type="dxa" w:w="2160"/>
+            <w:tcW w:type="dxa" w:w="2304"/>
           </w:tcPr>
           <w:p>
             <w:r>
               <w:rPr>
-                <w:sz w:val="17"/>
+                <w:rFonts w:ascii="Arial" w:hAnsi="Arial"/>
+                <w:sz w:val="16"/>
               </w:rPr>
               <w:t>Founder &amp; PM (Deadline: Day 30)</w:t>
             </w:r>
@@ -1271,55 +1377,74 @@
     </w:tbl>
     <w:p>
       <w:pPr>
-        <w:spacing w:before="160" w:after="60"/>
+        <w:spacing w:before="120" w:after="40"/>
         <w:shd w:val="clear" w:color="auto" w:fill="1F4E78"/>
       </w:pPr>
       <w:r>
         <w:rPr>
+          <w:rFonts w:ascii="Arial" w:hAnsi="Arial"/>
           <w:b/>
           <w:color w:val="FFFFFF"/>
-          <w:sz w:val="22"/>
+          <w:sz w:val="20"/>
         </w:rPr>
-        <w:t xml:space="preserve">  5. BÀI TEST NGƯỜI LẠ &amp; TỰ ĐỐI SOÁT 10 TIÊU CHÍ RUBRIC</w:t>
+        <w:t xml:space="preserve">  5. BÀI TEST NGƯỜI LẠ (2-MINUTE STRANGER TEST)</w:t>
       </w:r>
     </w:p>
     <w:p>
       <w:pPr>
-        <w:spacing w:after="40"/>
+        <w:spacing w:after="40" w:line="276" w:lineRule="auto"/>
       </w:pPr>
       <w:r>
         <w:rPr>
+          <w:rFonts w:ascii="Arial" w:hAnsi="Arial"/>
           <w:b/>
+          <w:sz w:val="17"/>
         </w:rPr>
         <w:t xml:space="preserve">1. Bạn bán gì, cho ai, tính tiền thế nào? </w:t>
       </w:r>
       <w:r>
-        <w:t>Agent AI xử lý ticket CSKH ca đêm cho E-commerce SME; tính tiền Hybrid: $99/tháng + $0.50/resolution (hoặc $0.60/resolution thuần).</w:t>
+        <w:rPr>
+          <w:rFonts w:ascii="Arial" w:hAnsi="Arial"/>
+          <w:sz w:val="17"/>
+        </w:rPr>
+        <w:t>Agent AI xử lý ticket CSKH ca đêm cho E-commerce SME; tính tiền Hybrid: $99/tháng + $0.50/resolution (hoặc $0.60/res thuần).</w:t>
         <w:br/>
       </w:r>
       <w:r>
         <w:rPr>
+          <w:rFonts w:ascii="Arial" w:hAnsi="Arial"/>
           <w:b/>
+          <w:sz w:val="17"/>
         </w:rPr>
         <w:t xml:space="preserve">2. Có lãi không, số nào chứng minh? </w:t>
       </w:r>
       <w:r>
-        <w:t>Cost/Job $0.1680, bán $0.60 -&gt; Gross Margin 72.0%. Breakeven Containment chỉ cần 68.4% (Eval thực tế 82.0% -&gt; Biên an toàn +13.6%).</w:t>
+        <w:rPr>
+          <w:rFonts w:ascii="Arial" w:hAnsi="Arial"/>
+          <w:sz w:val="17"/>
+        </w:rPr>
+        <w:t>Cost/Job $0.1680, bán $0.60 -&gt; Gross Margin 72.0%. Breakeven Containment 68.4% (Eval 82.0% -&gt; Biên an toàn +13.6%).</w:t>
         <w:br/>
       </w:r>
       <w:r>
         <w:rPr>
+          <w:rFonts w:ascii="Arial" w:hAnsi="Arial"/>
           <w:b/>
+          <w:sz w:val="17"/>
         </w:rPr>
         <w:t xml:space="preserve">3. Tiếp cận qua đâu, vì sao? </w:t>
       </w:r>
       <w:r>
+        <w:rPr>
+          <w:rFonts w:ascii="Arial" w:hAnsi="Arial"/>
+          <w:sz w:val="17"/>
+        </w:rPr>
         <w:t>Partner-Led (Pancake/Haravan). Vì ngân sách CAC $2,592 không thể nuôi Direct Sales (CAC $25,200 - lệch 9.7 lần). Cắm vào Pancake giúp giải đúng Pain Moment 23h đêm.</w:t>
       </w:r>
     </w:p>
     <w:sectPr>
       <w:pgSz w:w="12240" w:h="15840"/>
-      <w:pgMar w:top="864" w:right="864" w:bottom="864" w:left="864" w:header="720" w:footer="720" w:gutter="0"/>
+      <w:pgMar w:top="720" w:right="720" w:bottom="720" w:left="720" w:header="720" w:footer="720" w:gutter="0"/>
       <w:cols w:space="720"/>
       <w:docGrid w:linePitch="360"/>
     </w:sectPr>

</xml_diff>